<commit_message>
Fundus protocol ready for action
</commit_message>
<xml_diff>
--- a/src/app/sources/fundus.docx
+++ b/src/app/sources/fundus.docx
@@ -66,6 +66,16 @@
                 <w:b w:val="0"/>
                 <w:lang w:val="fr-FR"/>
               </w:rPr>
+              <w:t xml:space="preserve">Nom et Prénom : </w:t>
+            </w:r>
+            <w:bookmarkStart w:id="0" w:name="_GoBack"/>
+            <w:bookmarkEnd w:id="0"/>
+            <w:r>
+              <w:rPr>
+                <w:rFonts w:eastAsia="Yu Gothic" w:cstheme="minorHAnsi"/>
+                <w:b w:val="0"/>
+                <w:lang w:val="fr-FR"/>
+              </w:rPr>
               <w:t>@</w:t>
             </w:r>
             <w:proofErr w:type="spellStart"/>
@@ -76,6 +86,32 @@
                 <w:lang w:val="fr-FR"/>
               </w:rPr>
               <w:t>names</w:t>
+            </w:r>
+            <w:proofErr w:type="spellEnd"/>
+            <w:r>
+              <w:rPr>
+                <w:rFonts w:eastAsia="Yu Gothic" w:cstheme="minorHAnsi"/>
+                <w:b w:val="0"/>
+                <w:lang w:val="fr-FR"/>
+              </w:rPr>
+              <w:t>@</w:t>
+            </w:r>
+            <w:r>
+              <w:rPr>
+                <w:rFonts w:eastAsia="Yu Gothic" w:cstheme="minorHAnsi"/>
+                <w:b w:val="0"/>
+                <w:lang w:val="fr-FR"/>
+              </w:rPr>
+              <w:t xml:space="preserve">  @</w:t>
+            </w:r>
+            <w:proofErr w:type="spellStart"/>
+            <w:r>
+              <w:rPr>
+                <w:rFonts w:eastAsia="Yu Gothic" w:cstheme="minorHAnsi"/>
+                <w:b w:val="0"/>
+                <w:lang w:val="fr-FR"/>
+              </w:rPr>
+              <w:t>lastname</w:t>
             </w:r>
             <w:proofErr w:type="spellEnd"/>
             <w:r>
@@ -249,17 +285,13 @@
     </w:tbl>
     <w:p>
       <w:pPr>
-        <w:pStyle w:val="ListParagraph"/>
-        <w:ind w:left="1080"/>
         <w:rPr>
           <w:rFonts w:eastAsia="Yu Gothic" w:cstheme="minorHAnsi"/>
-          <w:b/>
           <w:lang w:val="fr-FR"/>
         </w:rPr>
       </w:pPr>
       <w:r>
         <w:rPr>
-          <w:rFonts w:eastAsia="Yu Gothic" w:cstheme="minorHAnsi"/>
           <w:noProof/>
           <w:lang w:val="fr-FR" w:eastAsia="fr-FR"/>
         </w:rPr>
@@ -329,922 +361,6 @@
             </w:pict>
           </mc:Fallback>
         </mc:AlternateContent>
-      </w:r>
-    </w:p>
-    <w:p>
-      <w:pPr>
-        <w:pStyle w:val="ListParagraph"/>
-        <w:numPr>
-          <w:ilvl w:val="0"/>
-          <w:numId w:val="2"/>
-        </w:numPr>
-        <w:rPr>
-          <w:rFonts w:eastAsia="Yu Gothic" w:cstheme="minorHAnsi"/>
-          <w:b/>
-          <w:lang w:val="fr-FR"/>
-        </w:rPr>
-      </w:pPr>
-      <w:r>
-        <w:rPr>
-          <w:rFonts w:eastAsia="Yu Gothic" w:cstheme="minorHAnsi"/>
-          <w:b/>
-          <w:lang w:val="fr-FR"/>
-        </w:rPr>
-        <w:t>ONH</w:t>
-      </w:r>
-    </w:p>
-    <w:p>
-      <w:pPr>
-        <w:ind w:left="360"/>
-        <w:rPr>
-          <w:rFonts w:eastAsia="Yu Gothic" w:cstheme="minorHAnsi"/>
-          <w:lang w:val="fr-FR"/>
-        </w:rPr>
-      </w:pPr>
-      <w:r>
-        <w:rPr>
-          <w:rFonts w:eastAsia="Yu Gothic" w:cstheme="minorHAnsi"/>
-          <w:lang w:val="fr-FR"/>
-        </w:rPr>
-        <w:t>Tête</w:t>
-      </w:r>
-      <w:r>
-        <w:rPr>
-          <w:rFonts w:eastAsia="Yu Gothic" w:cstheme="minorHAnsi"/>
-          <w:lang w:val="fr-FR"/>
-        </w:rPr>
-        <w:t xml:space="preserve"> du nerf optique de taille @</w:t>
-      </w:r>
-      <w:r>
-        <w:rPr>
-          <w:rFonts w:eastAsia="Yu Gothic" w:cstheme="minorHAnsi"/>
-          <w:lang w:val="fr-FR"/>
-        </w:rPr>
-        <w:t>size@</w:t>
-      </w:r>
-      <w:r>
-        <w:rPr>
-          <w:rFonts w:eastAsia="Yu Gothic" w:cstheme="minorHAnsi"/>
-          <w:lang w:val="fr-FR"/>
-        </w:rPr>
-        <w:t>, à b</w:t>
-      </w:r>
-      <w:r>
-        <w:rPr>
-          <w:rFonts w:eastAsia="Yu Gothic" w:cstheme="minorHAnsi"/>
-          <w:lang w:val="fr-FR"/>
-        </w:rPr>
-        <w:t>ords : @</w:t>
-      </w:r>
-      <w:proofErr w:type="spellStart"/>
-      <w:r>
-        <w:rPr>
-          <w:rFonts w:eastAsia="Yu Gothic" w:cstheme="minorHAnsi"/>
-          <w:lang w:val="fr-FR"/>
-        </w:rPr>
-        <w:t>margin</w:t>
-      </w:r>
-      <w:proofErr w:type="spellEnd"/>
-      <w:r>
-        <w:rPr>
-          <w:rFonts w:eastAsia="Yu Gothic" w:cstheme="minorHAnsi"/>
-          <w:lang w:val="fr-FR"/>
-        </w:rPr>
-        <w:t>@. La c</w:t>
-      </w:r>
-      <w:r>
-        <w:rPr>
-          <w:rFonts w:eastAsia="Yu Gothic" w:cstheme="minorHAnsi"/>
-          <w:lang w:val="fr-FR"/>
-        </w:rPr>
-        <w:t xml:space="preserve">ouleur de </w:t>
-      </w:r>
-      <w:r>
-        <w:rPr>
-          <w:rFonts w:eastAsia="Yu Gothic" w:cstheme="minorHAnsi"/>
-          <w:lang w:val="fr-FR"/>
-        </w:rPr>
-        <w:t xml:space="preserve">l’anneau neuro-rétinien est </w:t>
-      </w:r>
-      <w:r>
-        <w:rPr>
-          <w:rFonts w:eastAsia="Yu Gothic" w:cstheme="minorHAnsi"/>
-          <w:lang w:val="fr-FR"/>
-        </w:rPr>
-        <w:t>@</w:t>
-      </w:r>
-      <w:proofErr w:type="spellStart"/>
-      <w:r>
-        <w:rPr>
-          <w:rFonts w:eastAsia="Yu Gothic" w:cstheme="minorHAnsi"/>
-          <w:lang w:val="fr-FR"/>
-        </w:rPr>
-        <w:t>rim</w:t>
-      </w:r>
-      <w:proofErr w:type="spellEnd"/>
-      <w:r>
-        <w:rPr>
-          <w:rFonts w:eastAsia="Yu Gothic" w:cstheme="minorHAnsi"/>
-          <w:lang w:val="fr-FR"/>
-        </w:rPr>
-        <w:t>@</w:t>
-      </w:r>
-      <w:r>
-        <w:rPr>
-          <w:rFonts w:eastAsia="Yu Gothic" w:cstheme="minorHAnsi"/>
-          <w:lang w:val="fr-FR"/>
-        </w:rPr>
-        <w:t xml:space="preserve">. L’excavation est de </w:t>
-      </w:r>
-      <w:r>
-        <w:rPr>
-          <w:rFonts w:eastAsia="Yu Gothic" w:cstheme="minorHAnsi"/>
-          <w:lang w:val="fr-FR"/>
-        </w:rPr>
-        <w:t>@cdv</w:t>
-      </w:r>
-      <w:r>
-        <w:rPr>
-          <w:rFonts w:eastAsia="Yu Gothic" w:cstheme="minorHAnsi"/>
-          <w:lang w:val="fr-FR"/>
-        </w:rPr>
-        <w:t>@, C/D vertical et</w:t>
-      </w:r>
-      <w:r>
-        <w:rPr>
-          <w:rFonts w:eastAsia="Yu Gothic" w:cstheme="minorHAnsi"/>
-          <w:lang w:val="fr-FR"/>
-        </w:rPr>
-        <w:t xml:space="preserve"> @cdh</w:t>
-      </w:r>
-      <w:r>
-        <w:rPr>
-          <w:rFonts w:eastAsia="Yu Gothic" w:cstheme="minorHAnsi"/>
-          <w:lang w:val="fr-FR"/>
-        </w:rPr>
-        <w:t xml:space="preserve">@, C/D horizontal ; </w:t>
-      </w:r>
-      <w:r>
-        <w:rPr>
-          <w:rFonts w:eastAsia="Yu Gothic" w:cstheme="minorHAnsi"/>
-          <w:lang w:val="fr-FR"/>
-        </w:rPr>
-        <w:t>@asy@</w:t>
-      </w:r>
-      <w:r>
-        <w:rPr>
-          <w:rFonts w:eastAsia="Yu Gothic" w:cstheme="minorHAnsi"/>
-          <w:lang w:val="fr-FR"/>
-        </w:rPr>
-        <w:t>.</w:t>
-      </w:r>
-    </w:p>
-    <w:p>
-      <w:pPr>
-        <w:ind w:left="360"/>
-        <w:rPr>
-          <w:rFonts w:eastAsia="Yu Gothic" w:cstheme="minorHAnsi"/>
-          <w:lang w:val="fr-FR"/>
-        </w:rPr>
-      </w:pPr>
-      <w:r>
-        <w:rPr>
-          <w:rFonts w:eastAsia="Yu Gothic" w:cstheme="minorHAnsi"/>
-          <w:lang w:val="fr-FR"/>
-        </w:rPr>
-        <w:t>Autres signes associés retrouvés : @</w:t>
-      </w:r>
-      <w:proofErr w:type="spellStart"/>
-      <w:r>
-        <w:rPr>
-          <w:rFonts w:eastAsia="Yu Gothic" w:cstheme="minorHAnsi"/>
-          <w:lang w:val="fr-FR"/>
-        </w:rPr>
-        <w:t>signesonh</w:t>
-      </w:r>
-      <w:proofErr w:type="spellEnd"/>
-      <w:r>
-        <w:rPr>
-          <w:rFonts w:eastAsia="Yu Gothic" w:cstheme="minorHAnsi"/>
-          <w:lang w:val="fr-FR"/>
-        </w:rPr>
-        <w:t>@</w:t>
-      </w:r>
-    </w:p>
-    <w:p>
-      <w:pPr>
-        <w:pStyle w:val="ListParagraph"/>
-        <w:numPr>
-          <w:ilvl w:val="0"/>
-          <w:numId w:val="2"/>
-        </w:numPr>
-        <w:rPr>
-          <w:rFonts w:eastAsia="Yu Gothic" w:cstheme="minorHAnsi"/>
-          <w:b/>
-          <w:lang w:val="fr-FR"/>
-        </w:rPr>
-      </w:pPr>
-      <w:r>
-        <w:rPr>
-          <w:rFonts w:eastAsia="Yu Gothic" w:cstheme="minorHAnsi"/>
-          <w:b/>
-          <w:lang w:val="fr-FR"/>
-        </w:rPr>
-        <w:t xml:space="preserve">Macula </w:t>
-      </w:r>
-    </w:p>
-    <w:p>
-      <w:pPr>
-        <w:ind w:left="360"/>
-        <w:rPr>
-          <w:rFonts w:eastAsia="Yu Gothic" w:cstheme="minorHAnsi"/>
-          <w:lang w:val="fr-FR"/>
-        </w:rPr>
-      </w:pPr>
-      <w:r>
-        <w:rPr>
-          <w:rFonts w:eastAsia="Yu Gothic" w:cstheme="minorHAnsi"/>
-          <w:lang w:val="fr-FR"/>
-        </w:rPr>
-        <w:t>Le reflet maculaire est</w:t>
-      </w:r>
-      <w:r>
-        <w:rPr>
-          <w:rFonts w:eastAsia="Yu Gothic" w:cstheme="minorHAnsi"/>
-          <w:lang w:val="fr-FR"/>
-        </w:rPr>
-        <w:t xml:space="preserve"> @</w:t>
-      </w:r>
-      <w:proofErr w:type="spellStart"/>
-      <w:r>
-        <w:rPr>
-          <w:rFonts w:eastAsia="Yu Gothic" w:cstheme="minorHAnsi"/>
-          <w:lang w:val="fr-FR"/>
-        </w:rPr>
-        <w:t>mreflex</w:t>
-      </w:r>
-      <w:proofErr w:type="spellEnd"/>
-      <w:r>
-        <w:rPr>
-          <w:rFonts w:eastAsia="Yu Gothic" w:cstheme="minorHAnsi"/>
-          <w:lang w:val="fr-FR"/>
-        </w:rPr>
-        <w:t>@</w:t>
-      </w:r>
-      <w:r>
-        <w:rPr>
-          <w:rFonts w:eastAsia="Yu Gothic" w:cstheme="minorHAnsi"/>
-          <w:lang w:val="fr-FR"/>
-        </w:rPr>
-        <w:t xml:space="preserve">. Le profil maculaire </w:t>
-      </w:r>
-      <w:r>
-        <w:rPr>
-          <w:rFonts w:eastAsia="Yu Gothic" w:cstheme="minorHAnsi"/>
-          <w:lang w:val="fr-FR"/>
-        </w:rPr>
-        <w:t>@profile@</w:t>
-      </w:r>
-      <w:r>
-        <w:rPr>
-          <w:rFonts w:eastAsia="Yu Gothic" w:cstheme="minorHAnsi"/>
-          <w:lang w:val="fr-FR"/>
-        </w:rPr>
-        <w:t xml:space="preserve"> et le reflet de l’ILM est </w:t>
-      </w:r>
-      <w:r>
-        <w:rPr>
-          <w:rFonts w:eastAsia="Yu Gothic" w:cstheme="minorHAnsi"/>
-          <w:lang w:val="fr-FR"/>
-        </w:rPr>
-        <w:t>@</w:t>
-      </w:r>
-      <w:proofErr w:type="spellStart"/>
-      <w:r>
-        <w:rPr>
-          <w:rFonts w:eastAsia="Yu Gothic" w:cstheme="minorHAnsi"/>
-          <w:lang w:val="fr-FR"/>
-        </w:rPr>
-        <w:t>ilm</w:t>
-      </w:r>
-      <w:proofErr w:type="spellEnd"/>
-      <w:r>
-        <w:rPr>
-          <w:rFonts w:eastAsia="Yu Gothic" w:cstheme="minorHAnsi"/>
-          <w:lang w:val="fr-FR"/>
-        </w:rPr>
-        <w:t>@</w:t>
-      </w:r>
-      <w:r>
-        <w:rPr>
-          <w:rFonts w:eastAsia="Yu Gothic" w:cstheme="minorHAnsi"/>
-          <w:lang w:val="fr-FR"/>
-        </w:rPr>
-        <w:t>.</w:t>
-      </w:r>
-      <w:r>
-        <w:rPr>
-          <w:rFonts w:eastAsia="Yu Gothic" w:cstheme="minorHAnsi"/>
-          <w:lang w:val="fr-FR"/>
-        </w:rPr>
-        <w:br/>
-        <w:t xml:space="preserve">Décollement postérieur du vitré </w:t>
-      </w:r>
-      <w:r>
-        <w:rPr>
-          <w:rFonts w:eastAsia="Yu Gothic" w:cstheme="minorHAnsi"/>
-          <w:lang w:val="fr-FR"/>
-        </w:rPr>
-        <w:t>@</w:t>
-      </w:r>
-      <w:proofErr w:type="spellStart"/>
-      <w:r>
-        <w:rPr>
-          <w:rFonts w:eastAsia="Yu Gothic" w:cstheme="minorHAnsi"/>
-          <w:lang w:val="fr-FR"/>
-        </w:rPr>
-        <w:t>dvp</w:t>
-      </w:r>
-      <w:proofErr w:type="spellEnd"/>
-      <w:r>
-        <w:rPr>
-          <w:rFonts w:eastAsia="Yu Gothic" w:cstheme="minorHAnsi"/>
-          <w:lang w:val="fr-FR"/>
-        </w:rPr>
-        <w:t>@</w:t>
-      </w:r>
-      <w:r>
-        <w:rPr>
-          <w:rFonts w:eastAsia="Yu Gothic" w:cstheme="minorHAnsi"/>
-          <w:lang w:val="fr-FR"/>
-        </w:rPr>
-        <w:t>.</w:t>
-      </w:r>
-      <w:bookmarkStart w:id="0" w:name="_GoBack"/>
-      <w:bookmarkEnd w:id="0"/>
-    </w:p>
-    <w:p>
-      <w:pPr>
-        <w:ind w:left="360"/>
-        <w:rPr>
-          <w:rFonts w:eastAsia="Yu Gothic" w:cstheme="minorHAnsi"/>
-          <w:lang w:val="fr-FR"/>
-        </w:rPr>
-      </w:pPr>
-      <w:r>
-        <w:rPr>
-          <w:rFonts w:eastAsia="Yu Gothic" w:cstheme="minorHAnsi"/>
-          <w:lang w:val="fr-FR"/>
-        </w:rPr>
-        <w:t>Œdèmes et a</w:t>
-      </w:r>
-      <w:r>
-        <w:rPr>
-          <w:rFonts w:eastAsia="Yu Gothic" w:cstheme="minorHAnsi"/>
-          <w:lang w:val="fr-FR"/>
-        </w:rPr>
-        <w:t>utres l</w:t>
-      </w:r>
-      <w:r>
-        <w:rPr>
-          <w:rFonts w:eastAsia="Yu Gothic" w:cstheme="minorHAnsi"/>
-          <w:lang w:val="fr-FR"/>
-        </w:rPr>
-        <w:t>ésions : @</w:t>
-      </w:r>
-      <w:proofErr w:type="spellStart"/>
-      <w:r>
-        <w:rPr>
-          <w:rFonts w:eastAsia="Yu Gothic" w:cstheme="minorHAnsi"/>
-          <w:lang w:val="fr-FR"/>
-        </w:rPr>
-        <w:t>lesion</w:t>
-      </w:r>
-      <w:proofErr w:type="spellEnd"/>
-      <w:r>
-        <w:rPr>
-          <w:rFonts w:eastAsia="Yu Gothic" w:cstheme="minorHAnsi"/>
-          <w:lang w:val="fr-FR"/>
-        </w:rPr>
-        <w:t>@</w:t>
-      </w:r>
-    </w:p>
-    <w:p>
-      <w:pPr>
-        <w:pStyle w:val="ListParagraph"/>
-        <w:numPr>
-          <w:ilvl w:val="0"/>
-          <w:numId w:val="2"/>
-        </w:numPr>
-        <w:rPr>
-          <w:rFonts w:eastAsia="Yu Gothic" w:cstheme="minorHAnsi"/>
-          <w:b/>
-          <w:lang w:val="fr-FR"/>
-        </w:rPr>
-      </w:pPr>
-      <w:r>
-        <w:rPr>
-          <w:rFonts w:eastAsia="Yu Gothic" w:cstheme="minorHAnsi"/>
-          <w:b/>
-          <w:lang w:val="fr-FR"/>
-        </w:rPr>
-        <w:t>Rétine</w:t>
-      </w:r>
-    </w:p>
-    <w:p>
-      <w:pPr>
-        <w:ind w:left="360"/>
-        <w:rPr>
-          <w:rFonts w:eastAsia="Yu Gothic" w:cstheme="minorHAnsi"/>
-          <w:lang w:val="fr-FR"/>
-        </w:rPr>
-      </w:pPr>
-      <w:r>
-        <w:rPr>
-          <w:rFonts w:eastAsia="Yu Gothic" w:cstheme="minorHAnsi"/>
-          <w:lang w:val="fr-FR"/>
-        </w:rPr>
-        <w:t xml:space="preserve">Le fond du fond d’œil est </w:t>
-      </w:r>
-      <w:r>
-        <w:rPr>
-          <w:rFonts w:eastAsia="Yu Gothic" w:cstheme="minorHAnsi"/>
-          <w:lang w:val="fr-FR"/>
-        </w:rPr>
-        <w:t>@fond@</w:t>
-      </w:r>
-      <w:r>
-        <w:rPr>
-          <w:rFonts w:eastAsia="Yu Gothic" w:cstheme="minorHAnsi"/>
-          <w:lang w:val="fr-FR"/>
-        </w:rPr>
-        <w:t xml:space="preserve">, de couleur </w:t>
-      </w:r>
-      <w:r>
-        <w:rPr>
-          <w:rFonts w:eastAsia="Yu Gothic" w:cstheme="minorHAnsi"/>
-          <w:lang w:val="fr-FR"/>
-        </w:rPr>
-        <w:t>@</w:t>
-      </w:r>
-      <w:proofErr w:type="spellStart"/>
-      <w:r>
-        <w:rPr>
-          <w:rFonts w:eastAsia="Yu Gothic" w:cstheme="minorHAnsi"/>
-          <w:lang w:val="fr-FR"/>
-        </w:rPr>
-        <w:t>color</w:t>
-      </w:r>
-      <w:proofErr w:type="spellEnd"/>
-      <w:r>
-        <w:rPr>
-          <w:rFonts w:eastAsia="Yu Gothic" w:cstheme="minorHAnsi"/>
-          <w:lang w:val="fr-FR"/>
-        </w:rPr>
-        <w:t>@</w:t>
-      </w:r>
-      <w:r>
-        <w:rPr>
-          <w:rFonts w:eastAsia="Yu Gothic" w:cstheme="minorHAnsi"/>
-          <w:lang w:val="fr-FR"/>
-        </w:rPr>
-        <w:t>.</w:t>
-      </w:r>
-      <w:r>
-        <w:rPr>
-          <w:rFonts w:eastAsia="Yu Gothic" w:cstheme="minorHAnsi"/>
-          <w:lang w:val="fr-FR"/>
-        </w:rPr>
-        <w:br/>
-      </w:r>
-      <w:r>
-        <w:rPr>
-          <w:rFonts w:eastAsia="Yu Gothic" w:cstheme="minorHAnsi"/>
-          <w:lang w:val="fr-FR"/>
-        </w:rPr>
-        <w:t>Signes vasculaires diabétiques ou ischémiques :</w:t>
-      </w:r>
-      <w:r>
-        <w:rPr>
-          <w:rFonts w:eastAsia="Yu Gothic" w:cstheme="minorHAnsi"/>
-          <w:lang w:val="fr-FR"/>
-        </w:rPr>
-        <w:t xml:space="preserve"> @</w:t>
-      </w:r>
-      <w:proofErr w:type="spellStart"/>
-      <w:r>
-        <w:rPr>
-          <w:rFonts w:eastAsia="Yu Gothic" w:cstheme="minorHAnsi"/>
-          <w:lang w:val="fr-FR"/>
-        </w:rPr>
-        <w:t>diabetes</w:t>
-      </w:r>
-      <w:proofErr w:type="spellEnd"/>
-      <w:r>
-        <w:rPr>
-          <w:rFonts w:eastAsia="Yu Gothic" w:cstheme="minorHAnsi"/>
-          <w:lang w:val="fr-FR"/>
-        </w:rPr>
-        <w:t>@</w:t>
-      </w:r>
-      <w:r>
-        <w:rPr>
-          <w:rFonts w:eastAsia="Yu Gothic" w:cstheme="minorHAnsi"/>
-          <w:lang w:val="fr-FR"/>
-        </w:rPr>
-        <w:br/>
-      </w:r>
-      <w:r>
-        <w:rPr>
-          <w:rFonts w:eastAsia="Yu Gothic" w:cstheme="minorHAnsi"/>
-          <w:lang w:val="fr-FR"/>
-        </w:rPr>
-        <w:t>Autres signes : @</w:t>
-      </w:r>
-      <w:proofErr w:type="spellStart"/>
-      <w:r>
-        <w:rPr>
-          <w:rFonts w:eastAsia="Yu Gothic" w:cstheme="minorHAnsi"/>
-          <w:lang w:val="fr-FR"/>
-        </w:rPr>
-        <w:t>signesretina</w:t>
-      </w:r>
-      <w:proofErr w:type="spellEnd"/>
-      <w:r>
-        <w:rPr>
-          <w:rFonts w:eastAsia="Yu Gothic" w:cstheme="minorHAnsi"/>
-          <w:lang w:val="fr-FR"/>
-        </w:rPr>
-        <w:t>@</w:t>
-      </w:r>
-    </w:p>
-    <w:p>
-      <w:pPr>
-        <w:pStyle w:val="ListParagraph"/>
-        <w:numPr>
-          <w:ilvl w:val="0"/>
-          <w:numId w:val="2"/>
-        </w:numPr>
-        <w:rPr>
-          <w:rFonts w:eastAsia="Yu Gothic" w:cstheme="minorHAnsi"/>
-          <w:b/>
-          <w:lang w:val="fr-FR"/>
-        </w:rPr>
-      </w:pPr>
-      <w:r>
-        <w:rPr>
-          <w:rFonts w:eastAsia="Yu Gothic" w:cstheme="minorHAnsi"/>
-          <w:b/>
-          <w:lang w:val="fr-FR"/>
-        </w:rPr>
-        <w:t>Vaisseaux rétiniens</w:t>
-      </w:r>
-    </w:p>
-    <w:p>
-      <w:pPr>
-        <w:ind w:left="360"/>
-        <w:rPr>
-          <w:rFonts w:eastAsia="Yu Gothic" w:cstheme="minorHAnsi"/>
-          <w:lang w:val="fr-FR"/>
-        </w:rPr>
-      </w:pPr>
-      <w:r>
-        <w:rPr>
-          <w:rFonts w:eastAsia="Yu Gothic" w:cstheme="minorHAnsi"/>
-          <w:lang w:val="fr-FR"/>
-        </w:rPr>
-        <w:t xml:space="preserve">Le ratio A/V </w:t>
-      </w:r>
-      <w:r>
-        <w:rPr>
-          <w:rFonts w:eastAsia="Yu Gothic" w:cstheme="minorHAnsi"/>
-          <w:lang w:val="fr-FR"/>
-        </w:rPr>
-        <w:t>est @</w:t>
-      </w:r>
-      <w:r>
-        <w:rPr>
-          <w:rFonts w:eastAsia="Yu Gothic" w:cstheme="minorHAnsi"/>
-          <w:lang w:val="fr-FR"/>
-        </w:rPr>
-        <w:t>av</w:t>
-      </w:r>
-      <w:r>
-        <w:rPr>
-          <w:rFonts w:eastAsia="Yu Gothic" w:cstheme="minorHAnsi"/>
-          <w:lang w:val="fr-FR"/>
-        </w:rPr>
-        <w:t>@ avec</w:t>
-      </w:r>
-      <w:r>
-        <w:rPr>
-          <w:rFonts w:eastAsia="Yu Gothic" w:cstheme="minorHAnsi"/>
-          <w:lang w:val="fr-FR"/>
-        </w:rPr>
-        <w:t xml:space="preserve"> </w:t>
-      </w:r>
-      <w:r>
-        <w:rPr>
-          <w:rFonts w:eastAsia="Yu Gothic" w:cstheme="minorHAnsi"/>
-          <w:lang w:val="fr-FR"/>
-        </w:rPr>
-        <w:t>@</w:t>
-      </w:r>
-      <w:proofErr w:type="spellStart"/>
-      <w:r>
-        <w:rPr>
-          <w:rFonts w:eastAsia="Yu Gothic" w:cstheme="minorHAnsi"/>
-          <w:lang w:val="fr-FR"/>
-        </w:rPr>
-        <w:t>retrecissement</w:t>
-      </w:r>
-      <w:proofErr w:type="spellEnd"/>
-      <w:r>
-        <w:rPr>
-          <w:rFonts w:eastAsia="Yu Gothic" w:cstheme="minorHAnsi"/>
-          <w:lang w:val="fr-FR"/>
-        </w:rPr>
-        <w:t>@</w:t>
-      </w:r>
-      <w:r>
-        <w:rPr>
-          <w:rFonts w:eastAsia="Yu Gothic" w:cstheme="minorHAnsi"/>
-          <w:lang w:val="fr-FR"/>
-        </w:rPr>
-        <w:t>. Le reflet artériel est</w:t>
-      </w:r>
-      <w:r>
-        <w:rPr>
-          <w:rFonts w:eastAsia="Yu Gothic" w:cstheme="minorHAnsi"/>
-          <w:lang w:val="fr-FR"/>
-        </w:rPr>
-        <w:t xml:space="preserve"> @reflet@</w:t>
-      </w:r>
-      <w:r>
-        <w:rPr>
-          <w:rFonts w:eastAsia="Yu Gothic" w:cstheme="minorHAnsi"/>
-          <w:lang w:val="fr-FR"/>
-        </w:rPr>
-        <w:br/>
-      </w:r>
-      <w:r>
-        <w:rPr>
-          <w:rFonts w:eastAsia="Yu Gothic" w:cstheme="minorHAnsi"/>
-          <w:lang w:val="fr-FR"/>
-        </w:rPr>
-        <w:t>Signes de croisement A/V : @croisement@</w:t>
-      </w:r>
-      <w:r>
-        <w:rPr>
-          <w:rFonts w:eastAsia="Yu Gothic" w:cstheme="minorHAnsi"/>
-          <w:lang w:val="fr-FR"/>
-        </w:rPr>
-        <w:br/>
-      </w:r>
-      <w:r>
-        <w:rPr>
-          <w:rFonts w:eastAsia="Yu Gothic" w:cstheme="minorHAnsi"/>
-          <w:lang w:val="fr-FR"/>
-        </w:rPr>
-        <w:t>Autres</w:t>
-      </w:r>
-      <w:r>
-        <w:rPr>
-          <w:rFonts w:eastAsia="Yu Gothic" w:cstheme="minorHAnsi"/>
-          <w:lang w:val="fr-FR"/>
-        </w:rPr>
-        <w:t xml:space="preserve"> signes </w:t>
-      </w:r>
-      <w:r>
-        <w:rPr>
-          <w:rFonts w:eastAsia="Yu Gothic" w:cstheme="minorHAnsi"/>
-          <w:lang w:val="fr-FR"/>
-        </w:rPr>
-        <w:t> : @autres@</w:t>
-      </w:r>
-    </w:p>
-    <w:p>
-      <w:pPr>
-        <w:pStyle w:val="ListParagraph"/>
-        <w:numPr>
-          <w:ilvl w:val="0"/>
-          <w:numId w:val="2"/>
-        </w:numPr>
-        <w:rPr>
-          <w:rFonts w:eastAsia="Yu Gothic" w:cstheme="minorHAnsi"/>
-          <w:b/>
-          <w:lang w:val="fr-FR"/>
-        </w:rPr>
-      </w:pPr>
-      <w:r>
-        <w:rPr>
-          <w:rFonts w:eastAsia="Yu Gothic" w:cstheme="minorHAnsi"/>
-          <w:b/>
-          <w:color w:val="0A0A0A"/>
-          <w:shd w:val="clear" w:color="auto" w:fill="FFFFFF"/>
-          <w:lang w:val="fr-FR"/>
-        </w:rPr>
-        <w:t>Périphérie</w:t>
-      </w:r>
-    </w:p>
-    <w:p>
-      <w:pPr>
-        <w:ind w:left="360"/>
-        <w:rPr>
-          <w:rFonts w:eastAsia="Yu Gothic" w:cstheme="minorHAnsi"/>
-          <w:lang w:val="fr-FR"/>
-        </w:rPr>
-      </w:pPr>
-      <w:r>
-        <w:rPr>
-          <w:rFonts w:eastAsia="Yu Gothic" w:cstheme="minorHAnsi"/>
-          <w:lang w:val="fr-FR"/>
-        </w:rPr>
-        <w:t>L’</w:t>
-      </w:r>
-      <w:proofErr w:type="spellStart"/>
-      <w:r>
-        <w:rPr>
-          <w:rFonts w:eastAsia="Yu Gothic" w:cstheme="minorHAnsi"/>
-          <w:lang w:val="fr-FR"/>
-        </w:rPr>
-        <w:t>ora</w:t>
-      </w:r>
-      <w:proofErr w:type="spellEnd"/>
-      <w:r>
-        <w:rPr>
-          <w:rFonts w:eastAsia="Yu Gothic" w:cstheme="minorHAnsi"/>
-          <w:lang w:val="fr-FR"/>
-        </w:rPr>
-        <w:t xml:space="preserve"> </w:t>
-      </w:r>
-      <w:proofErr w:type="spellStart"/>
-      <w:r>
-        <w:rPr>
-          <w:rFonts w:eastAsia="Yu Gothic" w:cstheme="minorHAnsi"/>
-          <w:lang w:val="fr-FR"/>
-        </w:rPr>
-        <w:t>serrata</w:t>
-      </w:r>
-      <w:proofErr w:type="spellEnd"/>
-      <w:r>
-        <w:rPr>
-          <w:rFonts w:eastAsia="Yu Gothic" w:cstheme="minorHAnsi"/>
-          <w:lang w:val="fr-FR"/>
-        </w:rPr>
-        <w:t xml:space="preserve"> est </w:t>
-      </w:r>
-      <w:r>
-        <w:rPr>
-          <w:rFonts w:eastAsia="Yu Gothic" w:cstheme="minorHAnsi"/>
-          <w:lang w:val="fr-FR"/>
-        </w:rPr>
-        <w:t>@</w:t>
-      </w:r>
-      <w:proofErr w:type="spellStart"/>
-      <w:r>
-        <w:rPr>
-          <w:rFonts w:eastAsia="Yu Gothic" w:cstheme="minorHAnsi"/>
-          <w:lang w:val="fr-FR"/>
-        </w:rPr>
-        <w:t>ora</w:t>
-      </w:r>
-      <w:proofErr w:type="spellEnd"/>
-      <w:r>
-        <w:rPr>
-          <w:rFonts w:eastAsia="Yu Gothic" w:cstheme="minorHAnsi"/>
-          <w:lang w:val="fr-FR"/>
-        </w:rPr>
-        <w:t>@</w:t>
-      </w:r>
-      <w:r>
-        <w:rPr>
-          <w:rFonts w:eastAsia="Yu Gothic" w:cstheme="minorHAnsi"/>
-          <w:lang w:val="fr-FR"/>
-        </w:rPr>
-        <w:t xml:space="preserve"> et la base du vitré est </w:t>
-      </w:r>
-      <w:r>
-        <w:rPr>
-          <w:rFonts w:eastAsia="Yu Gothic" w:cstheme="minorHAnsi"/>
-          <w:lang w:val="fr-FR"/>
-        </w:rPr>
-        <w:t>@base@</w:t>
-      </w:r>
-      <w:r>
-        <w:rPr>
-          <w:rFonts w:eastAsia="Yu Gothic" w:cstheme="minorHAnsi"/>
-          <w:lang w:val="fr-FR"/>
-        </w:rPr>
-        <w:t>.</w:t>
-      </w:r>
-      <w:r>
-        <w:rPr>
-          <w:rFonts w:eastAsia="Yu Gothic" w:cstheme="minorHAnsi"/>
-          <w:lang w:val="fr-FR"/>
-        </w:rPr>
-        <w:br/>
-      </w:r>
-      <w:r>
-        <w:rPr>
-          <w:rFonts w:eastAsia="Yu Gothic" w:cstheme="minorHAnsi"/>
-          <w:lang w:val="fr-FR"/>
-        </w:rPr>
-        <w:t>Dégénérescences courantes (souvent sans danger) : @</w:t>
-      </w:r>
-      <w:proofErr w:type="spellStart"/>
-      <w:r>
-        <w:rPr>
-          <w:rFonts w:eastAsia="Yu Gothic" w:cstheme="minorHAnsi"/>
-          <w:lang w:val="fr-FR"/>
-        </w:rPr>
-        <w:t>benign</w:t>
-      </w:r>
-      <w:proofErr w:type="spellEnd"/>
-      <w:r>
-        <w:rPr>
-          <w:rFonts w:eastAsia="Yu Gothic" w:cstheme="minorHAnsi"/>
-          <w:lang w:val="fr-FR"/>
-        </w:rPr>
-        <w:t>@</w:t>
-      </w:r>
-      <w:r>
-        <w:rPr>
-          <w:rFonts w:eastAsia="Yu Gothic" w:cstheme="minorHAnsi"/>
-          <w:lang w:val="fr-FR"/>
-        </w:rPr>
-        <w:br/>
-      </w:r>
-      <w:r>
-        <w:rPr>
-          <w:rFonts w:eastAsia="Yu Gothic" w:cstheme="minorHAnsi"/>
-          <w:lang w:val="fr-FR"/>
-        </w:rPr>
-        <w:t>Zones de fragilité (à surveiller) : @</w:t>
-      </w:r>
-      <w:r>
-        <w:rPr>
-          <w:rFonts w:eastAsia="Yu Gothic" w:cstheme="minorHAnsi"/>
-          <w:lang w:val="fr-FR"/>
-        </w:rPr>
-        <w:t>high@</w:t>
-      </w:r>
-      <w:r>
-        <w:rPr>
-          <w:rFonts w:eastAsia="Yu Gothic" w:cstheme="minorHAnsi"/>
-          <w:lang w:val="fr-FR"/>
-        </w:rPr>
-        <w:br/>
-      </w:r>
-      <w:r>
-        <w:rPr>
-          <w:rFonts w:eastAsia="Yu Gothic" w:cstheme="minorHAnsi"/>
-          <w:lang w:val="fr-FR"/>
-        </w:rPr>
-        <w:t>Lésions aigue : @acute@</w:t>
-      </w:r>
-    </w:p>
-    <w:p>
-      <w:pPr>
-        <w:ind w:left="360"/>
-        <w:rPr>
-          <w:rFonts w:eastAsia="Yu Gothic" w:cstheme="minorHAnsi"/>
-          <w:lang w:val="fr-FR"/>
-        </w:rPr>
-      </w:pPr>
-    </w:p>
-    <w:p>
-      <w:pPr>
-        <w:ind w:left="360"/>
-        <w:rPr>
-          <w:rFonts w:eastAsia="Yu Gothic" w:cstheme="minorHAnsi"/>
-          <w:lang w:val="fr-FR"/>
-        </w:rPr>
-      </w:pPr>
-      <w:r>
-        <w:rPr>
-          <w:rFonts w:eastAsia="Yu Gothic" w:cstheme="minorHAnsi"/>
-          <w:lang w:val="fr-FR"/>
-        </w:rPr>
-        <w:t>CONCLUSION : @conclusion@</w:t>
-      </w:r>
-    </w:p>
-    <w:p>
-      <w:pPr>
-        <w:tabs>
-          <w:tab w:val="left" w:pos="6090"/>
-        </w:tabs>
-        <w:rPr>
-          <w:rFonts w:eastAsia="Yu Gothic" w:cstheme="minorHAnsi"/>
-          <w:lang w:val="fr-FR"/>
-        </w:rPr>
-      </w:pPr>
-      <w:r>
-        <w:rPr>
-          <w:rFonts w:eastAsia="Yu Gothic" w:cstheme="minorHAnsi"/>
-          <w:lang w:val="fr-FR"/>
-        </w:rPr>
-        <w:tab/>
       </w:r>
     </w:p>
     <w:sectPr>

</xml_diff>